<commit_message>
advanced 1: redrawn concept pictures, every prompt copyable, fictional names
- Explanation slides (1/2, 1/3, 1/15, 1/26-34, 1/44) redrawn as structured
  scenes with concrete example content and the Claude character.
- Every prompt a student types has a copy item, including /clear,
  /excel-filler and /word-filler.
- Example files and renders use 홍길동 / 한빛상사 instead of real names.
- 추석 notice rerun with a Pexels stock photo in the image slot (the course
  prompt now asks for it); credit in examples/word/stock_image_credit.txt.
- Overlap before/after shows the full body text uncropped.

Co-Authored-By: Claude Opus 5.5 <noreply@anthropic.com>
Claude-Session: https://claude.ai/code/session_017g4DmFx156Z4cwFfHGqfHi
</commit_message>
<xml_diff>
--- a/assets/advanced/step01/examples/word/공지사항_추석연휴_20260926.docx
+++ b/assets/advanced/step01/examples/word/공지사항_추석연휴_20260926.docx
@@ -944,60 +944,56 @@
         <w:tc>
           <w:tcPr>
             <w:tcW w:type="dxa" w:w="9638"/>
-            <w:tcBorders>
-              <w:top w:val="dashed" w:color="BBBBBB" w:sz="8"/>
-              <w:left w:val="dashed" w:color="BBBBBB" w:sz="8"/>
-              <w:bottom w:val="dashed" w:color="BBBBBB" w:sz="8"/>
-              <w:right w:val="dashed" w:color="BBBBBB" w:sz="8"/>
-            </w:tcBorders>
-            <w:shd w:fill="FAFAFA" w:color="auto" w:val="clear"/>
+            <w:tcMar>
+              <w:top w:w="0" w:type="dxa"/>
+              <w:left w:w="0" w:type="dxa"/>
+              <w:bottom w:w="0" w:type="dxa"/>
+              <w:right w:w="0" w:type="dxa"/>
+            </w:tcMar>
             <w:vAlign w:val="center"/>
           </w:tcPr>
           <w:p>
             <w:pPr>
-              <w:spacing w:after="80"/>
+              <w:spacing w:before="0" w:after="0" w:line="240" w:lineRule="auto"/>
               <w:jc w:val="center"/>
             </w:pPr>
             <w:r>
-              <w:rPr>
-                <w:rFonts w:ascii="Noto Sans KR" w:cs="Noto Sans KR" w:eastAsia="Noto Sans KR" w:hAnsi="Noto Sans KR"/>
-                <w:b/>
-                <w:bCs/>
-                <w:color w:val="999999"/>
-                <w:spacing w:val="80"/>
-                <w:sz w:val="24"/>
-                <w:szCs w:val="24"/>
-              </w:rPr>
-              <w:t xml:space="preserve">IMAGE</w:t>
-            </w:r>
-          </w:p>
-          <w:p>
-            <w:pPr>
-              <w:spacing w:after="40"/>
-              <w:jc w:val="center"/>
-            </w:pPr>
-            <w:r>
-              <w:rPr>
-                <w:rFonts w:ascii="Noto Sans KR" w:cs="Noto Sans KR" w:eastAsia="Noto Sans KR" w:hAnsi="Noto Sans KR"/>
-                <w:color w:val="999999"/>
-                <w:sz w:val="18"/>
-                <w:szCs w:val="18"/>
-              </w:rPr>
-              <w:t xml:space="preserve">이미지 영역  ·  17 × 4 cm (약 4:1, 예: 2000 × 480 px)</w:t>
-            </w:r>
-          </w:p>
-          <w:p>
-            <w:pPr>
-              <w:jc w:val="center"/>
-            </w:pPr>
-            <w:r>
-              <w:rPr>
-                <w:rFonts w:ascii="Noto Sans KR" w:cs="Noto Sans KR" w:eastAsia="Noto Sans KR" w:hAnsi="Noto Sans KR"/>
-                <w:color w:val="AAAAAA"/>
-                <w:sz w:val="16"/>
-                <w:szCs w:val="16"/>
-              </w:rPr>
-              <w:t xml:space="preserve">Unsplash · Pexels · Pixabay 등 무료 스톡 이미지를 이 박스에 삽입하세요</w:t>
+              <w:drawing>
+                <wp:inline distT="0" distB="0" distL="0" distR="0">
+                  <wp:extent cx="6120130" cy="1460500"/>
+                  <wp:effectExtent l="0" t="0" r="0" b="0"/>
+                  <wp:docPr id="101" name="notice image"/>
+                  <wp:cNvGraphicFramePr>
+                    <a:graphicFrameLocks xmlns:a="http://schemas.openxmlformats.org/drawingml/2006/main" noChangeAspect="1"/>
+                  </wp:cNvGraphicFramePr>
+                  <a:graphic xmlns:a="http://schemas.openxmlformats.org/drawingml/2006/main">
+                    <a:graphicData uri="http://schemas.openxmlformats.org/drawingml/2006/picture">
+                      <pic:pic xmlns:pic="http://schemas.openxmlformats.org/drawingml/2006/picture">
+                        <pic:nvPicPr>
+                          <pic:cNvPr id="0" name="추석_배너.jpg"/>
+                          <pic:cNvPicPr/>
+                        </pic:nvPicPr>
+                        <pic:blipFill>
+                          <a:blip r:embed="rId9"/>
+                          <a:srcRect l="0" t="32098" r="0" b="32098"/>
+                          <a:stretch>
+                            <a:fillRect/>
+                          </a:stretch>
+                        </pic:blipFill>
+                        <pic:spPr>
+                          <a:xfrm>
+                            <a:off x="0" y="0"/>
+                            <a:ext cx="6120130" cy="1460500"/>
+                          </a:xfrm>
+                          <a:prstGeom prst="rect">
+                            <a:avLst/>
+                          </a:prstGeom>
+                        </pic:spPr>
+                      </pic:pic>
+                    </a:graphicData>
+                  </a:graphic>
+                </wp:inline>
+              </w:drawing>
             </w:r>
           </w:p>
         </w:tc>
@@ -1032,7 +1028,7 @@
           <w:sz w:val="26"/>
           <w:szCs w:val="26"/>
         </w:rPr>
-        <w:t xml:space="preserve">우희인더스트리 주식회사  </w:t>
+        <w:t xml:space="preserve">한빛상사 주식회사  </w:t>
       </w:r>
       <w:r>
         <w:rPr>
@@ -1132,7 +1128,7 @@
         <w:sz w:val="15"/>
         <w:szCs w:val="15"/>
       </w:rPr>
-      <w:t xml:space="preserve">우희인더스트리 주식회사</w:t>
+      <w:t xml:space="preserve">한빛상사 주식회사</w:t>
     </w:r>
   </w:p>
 </w:ftr>

</xml_diff>